<commit_message>
Fix history server guide references
</commit_message>
<xml_diff>
--- a/odigoi/06_local_cluster_infrastructure_docker.docx
+++ b/odigoi/06_local_cluster_infrastructure_docker.docx
@@ -20,7 +20,7 @@
           <w:sz w:val="22"/>
           <w:szCs w:val="22"/>
         </w:rPr>
-        <w:id w:val="-1440668362"/>
+        <w:id w:val="-142971066"/>
         <w:docPartObj>
           <w:docPartGallery w:val="Table of Contents"/>
           <w:docPartUnique/>
@@ -61,7 +61,7 @@
           <w:r>
             <w:fldChar w:fldCharType="separate"/>
           </w:r>
-          <w:hyperlink w:anchor="_Toc227785271" w:history="1">
+          <w:hyperlink w:anchor="_Toc227829460" w:history="1">
             <w:r>
               <w:rPr>
                 <w:rStyle w:val="Hyperlink"/>
@@ -88,7 +88,7 @@
                 <w:noProof/>
                 <w:webHidden/>
               </w:rPr>
-              <w:instrText xml:space="preserve"> PAGEREF _Toc227785271 \h </w:instrText>
+              <w:instrText xml:space="preserve"> PAGEREF _Toc227829460 \h </w:instrText>
             </w:r>
             <w:r>
               <w:rPr>
@@ -135,7 +135,7 @@
               <w14:ligatures w14:val="standardContextual"/>
             </w:rPr>
           </w:pPr>
-          <w:hyperlink w:anchor="_Toc227785272" w:history="1">
+          <w:hyperlink w:anchor="_Toc227829461" w:history="1">
             <w:r>
               <w:rPr>
                 <w:rStyle w:val="Hyperlink"/>
@@ -162,7 +162,7 @@
                 <w:noProof/>
                 <w:webHidden/>
               </w:rPr>
-              <w:instrText xml:space="preserve"> PAGEREF _Toc227785272 \h </w:instrText>
+              <w:instrText xml:space="preserve"> PAGEREF _Toc227829461 \h </w:instrText>
             </w:r>
             <w:r>
               <w:rPr>
@@ -209,7 +209,7 @@
               <w14:ligatures w14:val="standardContextual"/>
             </w:rPr>
           </w:pPr>
-          <w:hyperlink w:anchor="_Toc227785273" w:history="1">
+          <w:hyperlink w:anchor="_Toc227829462" w:history="1">
             <w:r>
               <w:rPr>
                 <w:rStyle w:val="Hyperlink"/>
@@ -236,7 +236,7 @@
                 <w:noProof/>
                 <w:webHidden/>
               </w:rPr>
-              <w:instrText xml:space="preserve"> PAGEREF _Toc227785273 \h </w:instrText>
+              <w:instrText xml:space="preserve"> PAGEREF _Toc227829462 \h </w:instrText>
             </w:r>
             <w:r>
               <w:rPr>
@@ -283,7 +283,7 @@
               <w14:ligatures w14:val="standardContextual"/>
             </w:rPr>
           </w:pPr>
-          <w:hyperlink w:anchor="_Toc227785274" w:history="1">
+          <w:hyperlink w:anchor="_Toc227829463" w:history="1">
             <w:r>
               <w:rPr>
                 <w:rStyle w:val="Hyperlink"/>
@@ -310,7 +310,7 @@
                 <w:noProof/>
                 <w:webHidden/>
               </w:rPr>
-              <w:instrText xml:space="preserve"> PAGEREF _Toc227785274 \h </w:instrText>
+              <w:instrText xml:space="preserve"> PAGEREF _Toc227829463 \h </w:instrText>
             </w:r>
             <w:r>
               <w:rPr>
@@ -357,7 +357,7 @@
               <w14:ligatures w14:val="standardContextual"/>
             </w:rPr>
           </w:pPr>
-          <w:hyperlink w:anchor="_Toc227785275" w:history="1">
+          <w:hyperlink w:anchor="_Toc227829464" w:history="1">
             <w:r>
               <w:rPr>
                 <w:rStyle w:val="Hyperlink"/>
@@ -384,7 +384,7 @@
                 <w:noProof/>
                 <w:webHidden/>
               </w:rPr>
-              <w:instrText xml:space="preserve"> PAGEREF _Toc227785275 \h </w:instrText>
+              <w:instrText xml:space="preserve"> PAGEREF _Toc227829464 \h </w:instrText>
             </w:r>
             <w:r>
               <w:rPr>
@@ -431,7 +431,7 @@
               <w14:ligatures w14:val="standardContextual"/>
             </w:rPr>
           </w:pPr>
-          <w:hyperlink w:anchor="_Toc227785276" w:history="1">
+          <w:hyperlink w:anchor="_Toc227829465" w:history="1">
             <w:r>
               <w:rPr>
                 <w:rStyle w:val="Hyperlink"/>
@@ -458,7 +458,7 @@
                 <w:noProof/>
                 <w:webHidden/>
               </w:rPr>
-              <w:instrText xml:space="preserve"> PAGEREF _Toc227785276 \h </w:instrText>
+              <w:instrText xml:space="preserve"> PAGEREF _Toc227829465 \h </w:instrText>
             </w:r>
             <w:r>
               <w:rPr>
@@ -505,7 +505,7 @@
               <w14:ligatures w14:val="standardContextual"/>
             </w:rPr>
           </w:pPr>
-          <w:hyperlink w:anchor="_Toc227785277" w:history="1">
+          <w:hyperlink w:anchor="_Toc227829466" w:history="1">
             <w:r>
               <w:rPr>
                 <w:rStyle w:val="Hyperlink"/>
@@ -532,7 +532,7 @@
                 <w:noProof/>
                 <w:webHidden/>
               </w:rPr>
-              <w:instrText xml:space="preserve"> PAGEREF _Toc227785277 \h </w:instrText>
+              <w:instrText xml:space="preserve"> PAGEREF _Toc227829466 \h </w:instrText>
             </w:r>
             <w:r>
               <w:rPr>
@@ -579,7 +579,7 @@
               <w14:ligatures w14:val="standardContextual"/>
             </w:rPr>
           </w:pPr>
-          <w:hyperlink w:anchor="_Toc227785278" w:history="1">
+          <w:hyperlink w:anchor="_Toc227829467" w:history="1">
             <w:r>
               <w:rPr>
                 <w:rStyle w:val="Hyperlink"/>
@@ -606,7 +606,7 @@
                 <w:noProof/>
                 <w:webHidden/>
               </w:rPr>
-              <w:instrText xml:space="preserve"> PAGEREF _Toc227785278 \h </w:instrText>
+              <w:instrText xml:space="preserve"> PAGEREF _Toc227829467 \h </w:instrText>
             </w:r>
             <w:r>
               <w:rPr>
@@ -653,7 +653,7 @@
               <w14:ligatures w14:val="standardContextual"/>
             </w:rPr>
           </w:pPr>
-          <w:hyperlink w:anchor="_Toc227785279" w:history="1">
+          <w:hyperlink w:anchor="_Toc227829468" w:history="1">
             <w:r>
               <w:rPr>
                 <w:rStyle w:val="Hyperlink"/>
@@ -680,7 +680,7 @@
                 <w:noProof/>
                 <w:webHidden/>
               </w:rPr>
-              <w:instrText xml:space="preserve"> PAGEREF _Toc227785279 \h </w:instrText>
+              <w:instrText xml:space="preserve"> PAGEREF _Toc227829468 \h </w:instrText>
             </w:r>
             <w:r>
               <w:rPr>
@@ -713,6 +713,80 @@
         </w:p>
         <w:p>
           <w:pPr>
+            <w:pStyle w:val="TOC2"/>
+            <w:tabs>
+              <w:tab w:val="right" w:leader="dot" w:pos="10530"/>
+            </w:tabs>
+            <w:rPr>
+              <w:rFonts w:asciiTheme="minorHAnsi" w:hAnsiTheme="minorHAnsi"/>
+              <w:noProof/>
+              <w:kern w:val="2"/>
+              <w:sz w:val="24"/>
+              <w:szCs w:val="24"/>
+              <w:lang w:val="el-GR" w:eastAsia="el-GR" w:bidi="he-IL"/>
+              <w14:ligatures w14:val="standardContextual"/>
+            </w:rPr>
+          </w:pPr>
+          <w:hyperlink w:anchor="_Toc227829469" w:history="1">
+            <w:r>
+              <w:rPr>
+                <w:rStyle w:val="Hyperlink"/>
+                <w:noProof/>
+              </w:rPr>
+              <w:t>Διακομιστής ιστορικού</w:t>
+            </w:r>
+            <w:r>
+              <w:rPr>
+                <w:noProof/>
+                <w:webHidden/>
+              </w:rPr>
+              <w:tab/>
+            </w:r>
+            <w:r>
+              <w:rPr>
+                <w:noProof/>
+                <w:webHidden/>
+              </w:rPr>
+              <w:fldChar w:fldCharType="begin"/>
+            </w:r>
+            <w:r>
+              <w:rPr>
+                <w:noProof/>
+                <w:webHidden/>
+              </w:rPr>
+              <w:instrText xml:space="preserve"> PAGEREF _Toc227829469 \h </w:instrText>
+            </w:r>
+            <w:r>
+              <w:rPr>
+                <w:noProof/>
+                <w:webHidden/>
+              </w:rPr>
+            </w:r>
+            <w:r>
+              <w:rPr>
+                <w:noProof/>
+                <w:webHidden/>
+              </w:rPr>
+              <w:fldChar w:fldCharType="separate"/>
+            </w:r>
+            <w:r>
+              <w:rPr>
+                <w:noProof/>
+                <w:webHidden/>
+              </w:rPr>
+              <w:t>22</w:t>
+            </w:r>
+            <w:r>
+              <w:rPr>
+                <w:noProof/>
+                <w:webHidden/>
+              </w:rPr>
+              <w:fldChar w:fldCharType="end"/>
+            </w:r>
+          </w:hyperlink>
+        </w:p>
+        <w:p>
+          <w:pPr>
             <w:pStyle w:val="TOC1"/>
             <w:tabs>
               <w:tab w:val="right" w:leader="dot" w:pos="10530"/>
@@ -727,7 +801,7 @@
               <w14:ligatures w14:val="standardContextual"/>
             </w:rPr>
           </w:pPr>
-          <w:hyperlink w:anchor="_Toc227785280" w:history="1">
+          <w:hyperlink w:anchor="_Toc227829470" w:history="1">
             <w:r>
               <w:rPr>
                 <w:rStyle w:val="Hyperlink"/>
@@ -754,7 +828,7 @@
                 <w:noProof/>
                 <w:webHidden/>
               </w:rPr>
-              <w:instrText xml:space="preserve"> PAGEREF _Toc227785280 \h </w:instrText>
+              <w:instrText xml:space="preserve"> PAGEREF _Toc227829470 \h </w:instrText>
             </w:r>
             <w:r>
               <w:rPr>
@@ -895,7 +969,7 @@
         <w:pStyle w:val="Heading1"/>
       </w:pPr>
       <w:bookmarkStart w:id="0" w:name="προέλεγχος-docker-στο-wsl"/>
-      <w:bookmarkStart w:id="1" w:name="_Toc227785271"/>
+      <w:bookmarkStart w:id="1" w:name="_Toc227829460"/>
       <w:r>
         <w:t>Προέλεγχος Docker στο WSL</w:t>
       </w:r>
@@ -990,6 +1064,7 @@
         <w:pStyle w:val="BodyText"/>
       </w:pPr>
       <w:r>
+        <w:lastRenderedPageBreak/>
         <w:t xml:space="preserve">Αν χρησιμοποιείτε αυτόνομο </w:t>
       </w:r>
       <w:r>
@@ -1010,7 +1085,6 @@
         <w:rPr>
           <w:rStyle w:val="ExtensionTok"/>
         </w:rPr>
-        <w:lastRenderedPageBreak/>
         <w:t>systemctl</w:t>
       </w:r>
       <w:r>
@@ -1039,7 +1113,7 @@
         <w:pStyle w:val="Heading1"/>
       </w:pPr>
       <w:bookmarkStart w:id="2" w:name="αρχιτεκτονική-hdfs-και-spark"/>
-      <w:bookmarkStart w:id="3" w:name="_Toc227785272"/>
+      <w:bookmarkStart w:id="3" w:name="_Toc227829461"/>
       <w:bookmarkEnd w:id="0"/>
       <w:r>
         <w:t>Αρχιτεκτονική HDFS και Spark</w:t>
@@ -1070,7 +1144,7 @@
           <w:noProof/>
         </w:rPr>
         <w:drawing>
-          <wp:inline distT="0" distB="0" distL="0" distR="0" wp14:anchorId="11AF837A" wp14:editId="15538F6D">
+          <wp:inline distT="0" distB="0" distL="0" distR="0" wp14:anchorId="75002A96" wp14:editId="226EB49B">
             <wp:extent cx="6692900" cy="4625299"/>
             <wp:effectExtent l="0" t="0" r="0" b="0"/>
             <wp:docPr id="23" name="Picture" descr="Εικόνα 1"/>
@@ -1173,7 +1247,7 @@
         </w:rPr>
         <w:lastRenderedPageBreak/>
         <w:drawing>
-          <wp:inline distT="0" distB="0" distL="0" distR="0" wp14:anchorId="41B2139A" wp14:editId="67A6CDF7">
+          <wp:inline distT="0" distB="0" distL="0" distR="0" wp14:anchorId="0C135862" wp14:editId="5D32524F">
             <wp:extent cx="6680200" cy="4470400"/>
             <wp:effectExtent l="0" t="0" r="0" b="0"/>
             <wp:docPr id="26" name="Picture" descr="Εικόνα 2"/>
@@ -1224,7 +1298,7 @@
           <w:noProof/>
         </w:rPr>
         <w:drawing>
-          <wp:inline distT="0" distB="0" distL="0" distR="0" wp14:anchorId="05386077" wp14:editId="5ED95FA3">
+          <wp:inline distT="0" distB="0" distL="0" distR="0" wp14:anchorId="6E8C8F11" wp14:editId="21596E5F">
             <wp:extent cx="6692900" cy="3111152"/>
             <wp:effectExtent l="0" t="0" r="0" b="0"/>
             <wp:docPr id="29" name="Picture" descr="Εικόνα 3"/>
@@ -1329,7 +1403,7 @@
         <w:pStyle w:val="Heading1"/>
       </w:pPr>
       <w:bookmarkStart w:id="4" w:name="βασικές-έννοιες-docker"/>
-      <w:bookmarkStart w:id="5" w:name="_Toc227785273"/>
+      <w:bookmarkStart w:id="5" w:name="_Toc227829462"/>
       <w:bookmarkEnd w:id="2"/>
       <w:r>
         <w:t>Βασικές έννοιες Docker</w:t>
@@ -1747,7 +1821,7 @@
           <w:noProof/>
         </w:rPr>
         <w:drawing>
-          <wp:inline distT="0" distB="0" distL="0" distR="0" wp14:anchorId="5436E913" wp14:editId="59985737">
+          <wp:inline distT="0" distB="0" distL="0" distR="0" wp14:anchorId="7EEBFB43" wp14:editId="3E1347DB">
             <wp:extent cx="6692900" cy="2040481"/>
             <wp:effectExtent l="0" t="0" r="0" b="0"/>
             <wp:docPr id="33" name="Picture" descr="Εικόνα 4"/>
@@ -1821,7 +1895,7 @@
           <w:noProof/>
         </w:rPr>
         <w:drawing>
-          <wp:inline distT="0" distB="0" distL="0" distR="0" wp14:anchorId="4456C69A" wp14:editId="500DD1D1">
+          <wp:inline distT="0" distB="0" distL="0" distR="0" wp14:anchorId="04B8629F" wp14:editId="30AC1ADF">
             <wp:extent cx="5707781" cy="346509"/>
             <wp:effectExtent l="0" t="0" r="0" b="0"/>
             <wp:docPr id="36" name="Picture" descr="Εικόνα 5"/>
@@ -1951,7 +2025,7 @@
         <w:pStyle w:val="Heading1"/>
       </w:pPr>
       <w:bookmarkStart w:id="6" w:name="Xea4649a608c1d80704b1c93c78a1c2b4da6dc26"/>
-      <w:bookmarkStart w:id="7" w:name="_Toc227785274"/>
+      <w:bookmarkStart w:id="7" w:name="_Toc227829463"/>
       <w:bookmarkEnd w:id="4"/>
       <w:r>
         <w:t>Δημιουργία τοπικής συστοιχίας Apache Spark και HDFS με περιέκτες Docker</w:t>
@@ -2320,7 +2394,7 @@
         <w:pStyle w:val="Heading1"/>
       </w:pPr>
       <w:bookmarkStart w:id="8" w:name="πώς-συνδέονται-οι-υπηρεσίες-μεταξύ-τους"/>
-      <w:bookmarkStart w:id="9" w:name="_Toc227785275"/>
+      <w:bookmarkStart w:id="9" w:name="_Toc227829464"/>
       <w:bookmarkEnd w:id="6"/>
       <w:r>
         <w:t>Πώς συνδέονται οι υπηρεσίες μεταξύ τους</w:t>
@@ -2794,7 +2868,7 @@
         </w:rPr>
         <w:lastRenderedPageBreak/>
         <w:drawing>
-          <wp:inline distT="0" distB="0" distL="0" distR="0" wp14:anchorId="3D3730E4" wp14:editId="095B7F3C">
+          <wp:inline distT="0" distB="0" distL="0" distR="0" wp14:anchorId="558F9DD3" wp14:editId="01A68611">
             <wp:extent cx="6692900" cy="3291679"/>
             <wp:effectExtent l="0" t="0" r="0" b="0"/>
             <wp:docPr id="41" name="Picture" descr="Εικόνα 6"/>
@@ -2867,7 +2941,7 @@
           <w:noProof/>
         </w:rPr>
         <w:drawing>
-          <wp:inline distT="0" distB="0" distL="0" distR="0" wp14:anchorId="162CE390" wp14:editId="5322B8B8">
+          <wp:inline distT="0" distB="0" distL="0" distR="0" wp14:anchorId="6C71E88E" wp14:editId="68F37A22">
             <wp:extent cx="6692900" cy="788569"/>
             <wp:effectExtent l="0" t="0" r="0" b="0"/>
             <wp:docPr id="44" name="Picture" descr="Εικόνα 7"/>
@@ -2936,7 +3010,7 @@
         </w:rPr>
         <w:lastRenderedPageBreak/>
         <w:drawing>
-          <wp:inline distT="0" distB="0" distL="0" distR="0" wp14:anchorId="76154787" wp14:editId="2965FA55">
+          <wp:inline distT="0" distB="0" distL="0" distR="0" wp14:anchorId="5FA15AF8" wp14:editId="4C2BB628">
             <wp:extent cx="6438900" cy="10591800"/>
             <wp:effectExtent l="0" t="0" r="0" b="0"/>
             <wp:docPr id="47" name="Picture" descr="Εικόνα 8"/>
@@ -3060,7 +3134,7 @@
         </w:rPr>
         <w:lastRenderedPageBreak/>
         <w:drawing>
-          <wp:inline distT="0" distB="0" distL="0" distR="0" wp14:anchorId="4841651F" wp14:editId="0FD132BA">
+          <wp:inline distT="0" distB="0" distL="0" distR="0" wp14:anchorId="43F8031C" wp14:editId="1C9C1633">
             <wp:extent cx="6692900" cy="7709300"/>
             <wp:effectExtent l="0" t="0" r="0" b="0"/>
             <wp:docPr id="50" name="Picture" descr="Εικόνα 9"/>
@@ -3191,7 +3265,7 @@
           <w:noProof/>
         </w:rPr>
         <w:drawing>
-          <wp:inline distT="0" distB="0" distL="0" distR="0" wp14:anchorId="6793C297" wp14:editId="2A9CFD76">
+          <wp:inline distT="0" distB="0" distL="0" distR="0" wp14:anchorId="2B0C71E1" wp14:editId="177985EE">
             <wp:extent cx="6692900" cy="5648755"/>
             <wp:effectExtent l="0" t="0" r="0" b="0"/>
             <wp:docPr id="53" name="Picture" descr="Εικόνα 10"/>
@@ -3279,7 +3353,7 @@
         </w:rPr>
         <w:lastRenderedPageBreak/>
         <w:drawing>
-          <wp:inline distT="0" distB="0" distL="0" distR="0" wp14:anchorId="63B47334" wp14:editId="1CB47BD7">
+          <wp:inline distT="0" distB="0" distL="0" distR="0" wp14:anchorId="2C13AFFD" wp14:editId="0A533D0D">
             <wp:extent cx="6692900" cy="3630867"/>
             <wp:effectExtent l="0" t="0" r="0" b="0"/>
             <wp:docPr id="56" name="Picture" descr="Εικόνα 11"/>
@@ -3352,7 +3426,7 @@
           <w:noProof/>
         </w:rPr>
         <w:drawing>
-          <wp:inline distT="0" distB="0" distL="0" distR="0" wp14:anchorId="52FFBACD" wp14:editId="37AE2031">
+          <wp:inline distT="0" distB="0" distL="0" distR="0" wp14:anchorId="3659E1C8" wp14:editId="31378921">
             <wp:extent cx="6429675" cy="1761423"/>
             <wp:effectExtent l="0" t="0" r="0" b="0"/>
             <wp:docPr id="59" name="Picture" descr="Εικόνα 12"/>
@@ -3407,7 +3481,7 @@
         <w:pStyle w:val="Heading2"/>
       </w:pPr>
       <w:bookmarkStart w:id="10" w:name="αν-χρησιμοποιείτε-docker-desktop"/>
-      <w:bookmarkStart w:id="11" w:name="_Toc227785276"/>
+      <w:bookmarkStart w:id="11" w:name="_Toc227829465"/>
       <w:r>
         <w:t>Αν χρησιμοποιείτε Docker Desktop</w:t>
       </w:r>
@@ -3445,7 +3519,7 @@
         </w:rPr>
         <w:lastRenderedPageBreak/>
         <w:drawing>
-          <wp:inline distT="0" distB="0" distL="0" distR="0" wp14:anchorId="2E15C9D9" wp14:editId="14ED5FB4">
+          <wp:inline distT="0" distB="0" distL="0" distR="0" wp14:anchorId="3A9477CD" wp14:editId="6CC4D1E1">
             <wp:extent cx="2483317" cy="6477802"/>
             <wp:effectExtent l="0" t="0" r="0" b="0"/>
             <wp:docPr id="62" name="Picture" descr="Εικόνα 13"/>
@@ -3536,7 +3610,7 @@
           <w:noProof/>
         </w:rPr>
         <w:drawing>
-          <wp:inline distT="0" distB="0" distL="0" distR="0" wp14:anchorId="717D3602" wp14:editId="6B8DDEB7">
+          <wp:inline distT="0" distB="0" distL="0" distR="0" wp14:anchorId="55B49FD8" wp14:editId="0D650C18">
             <wp:extent cx="6692900" cy="1923612"/>
             <wp:effectExtent l="0" t="0" r="0" b="0"/>
             <wp:docPr id="65" name="Picture" descr="Εικόνα 14"/>
@@ -3673,7 +3747,7 @@
           <w:noProof/>
         </w:rPr>
         <w:drawing>
-          <wp:inline distT="0" distB="0" distL="0" distR="0" wp14:anchorId="3CA5F337" wp14:editId="45704BA3">
+          <wp:inline distT="0" distB="0" distL="0" distR="0" wp14:anchorId="788DBA66" wp14:editId="7034D868">
             <wp:extent cx="6692900" cy="2360127"/>
             <wp:effectExtent l="0" t="0" r="0" b="0"/>
             <wp:docPr id="68" name="Picture" descr="Εικόνα 15"/>
@@ -3720,7 +3794,7 @@
         <w:pStyle w:val="Heading2"/>
       </w:pPr>
       <w:bookmarkStart w:id="12" w:name="Xbd2e785ab500aaf081e610b0667b69cb3736269"/>
-      <w:bookmarkStart w:id="13" w:name="_Toc227785277"/>
+      <w:bookmarkStart w:id="13" w:name="_Toc227829466"/>
       <w:bookmarkEnd w:id="10"/>
       <w:r>
         <w:t>Αν χρησιμοποιείτε αυτόνομο Docker Engine μέσα στο WSL</w:t>
@@ -5885,7 +5959,7 @@
           <w:noProof/>
         </w:rPr>
         <w:drawing>
-          <wp:inline distT="0" distB="0" distL="0" distR="0" wp14:anchorId="00129113" wp14:editId="635425BF">
+          <wp:inline distT="0" distB="0" distL="0" distR="0" wp14:anchorId="365F09A3" wp14:editId="770195CB">
             <wp:extent cx="6692900" cy="3823835"/>
             <wp:effectExtent l="0" t="0" r="0" b="0"/>
             <wp:docPr id="72" name="Picture" descr="Εικόνα 16"/>
@@ -5932,7 +6006,7 @@
         <w:pStyle w:val="Heading1"/>
       </w:pPr>
       <w:bookmarkStart w:id="14" w:name="εκτέλεση-προγραμμάτων-στη-συστοιχία"/>
-      <w:bookmarkStart w:id="15" w:name="_Toc227785278"/>
+      <w:bookmarkStart w:id="15" w:name="_Toc227829467"/>
       <w:bookmarkEnd w:id="8"/>
       <w:bookmarkEnd w:id="12"/>
       <w:r>
@@ -6097,7 +6171,7 @@
           <w:noProof/>
         </w:rPr>
         <w:drawing>
-          <wp:inline distT="0" distB="0" distL="0" distR="0" wp14:anchorId="2E38F1CC" wp14:editId="59A0E551">
+          <wp:inline distT="0" distB="0" distL="0" distR="0" wp14:anchorId="12DC75F3" wp14:editId="2EA59FA7">
             <wp:extent cx="6692900" cy="1101215"/>
             <wp:effectExtent l="0" t="0" r="0" b="0"/>
             <wp:docPr id="77" name="Picture" descr="Εικόνα 17"/>
@@ -6170,7 +6244,7 @@
           <w:noProof/>
         </w:rPr>
         <w:drawing>
-          <wp:inline distT="0" distB="0" distL="0" distR="0" wp14:anchorId="0C8A35D6" wp14:editId="2D400B51">
+          <wp:inline distT="0" distB="0" distL="0" distR="0" wp14:anchorId="22EAA23C" wp14:editId="1E5EA619">
             <wp:extent cx="6692900" cy="1722842"/>
             <wp:effectExtent l="0" t="0" r="0" b="0"/>
             <wp:docPr id="80" name="Picture" descr="Εικόνα 18"/>
@@ -6270,7 +6344,7 @@
           <w:noProof/>
         </w:rPr>
         <w:drawing>
-          <wp:inline distT="0" distB="0" distL="0" distR="0" wp14:anchorId="0CFEDB3A" wp14:editId="282CE769">
+          <wp:inline distT="0" distB="0" distL="0" distR="0" wp14:anchorId="3016DFCE" wp14:editId="7894A9B0">
             <wp:extent cx="6692900" cy="397769"/>
             <wp:effectExtent l="0" t="0" r="0" b="0"/>
             <wp:docPr id="83" name="Picture" descr="Εικόνα 24"/>
@@ -9094,7 +9168,7 @@
           <w:noProof/>
         </w:rPr>
         <w:drawing>
-          <wp:inline distT="0" distB="0" distL="0" distR="0" wp14:anchorId="5DB6687B" wp14:editId="39D31F82">
+          <wp:inline distT="0" distB="0" distL="0" distR="0" wp14:anchorId="7A3ECC8E" wp14:editId="563A5B18">
             <wp:extent cx="6692900" cy="1694227"/>
             <wp:effectExtent l="0" t="0" r="0" b="0"/>
             <wp:docPr id="86" name="Picture" descr="Εικόνα 19"/>
@@ -9206,7 +9280,7 @@
           <w:noProof/>
         </w:rPr>
         <w:drawing>
-          <wp:inline distT="0" distB="0" distL="0" distR="0" wp14:anchorId="736C9C7C" wp14:editId="28BC2E38">
+          <wp:inline distT="0" distB="0" distL="0" distR="0" wp14:anchorId="17C59D22" wp14:editId="1329ED08">
             <wp:extent cx="6692900" cy="761605"/>
             <wp:effectExtent l="0" t="0" r="0" b="0"/>
             <wp:docPr id="89" name="Picture" descr="Εικόνα 20"/>
@@ -9605,7 +9679,7 @@
         <w:pStyle w:val="Heading1"/>
       </w:pPr>
       <w:bookmarkStart w:id="16" w:name="X7a168f6e489465ead18c75b7f02ad077304a52f"/>
-      <w:bookmarkStart w:id="17" w:name="_Toc227785279"/>
+      <w:bookmarkStart w:id="17" w:name="_Toc227829468"/>
       <w:bookmarkEnd w:id="14"/>
       <w:r>
         <w:lastRenderedPageBreak/>
@@ -10215,7 +10289,7 @@
           <w:noProof/>
         </w:rPr>
         <w:drawing>
-          <wp:inline distT="0" distB="0" distL="0" distR="0" wp14:anchorId="5645E6D8" wp14:editId="52B5D7C4">
+          <wp:inline distT="0" distB="0" distL="0" distR="0" wp14:anchorId="4A7710EA" wp14:editId="54D0C603">
             <wp:extent cx="6692900" cy="6026364"/>
             <wp:effectExtent l="0" t="0" r="0" b="0"/>
             <wp:docPr id="93" name="Picture" descr="Εικόνα 21"/>
@@ -10259,17 +10333,18 @@
     </w:p>
     <w:p>
       <w:pPr>
-        <w:pStyle w:val="BodyText"/>
-      </w:pPr>
-      <w:r>
-        <w:rPr>
-          <w:b/>
-          <w:bCs/>
-        </w:rPr>
+        <w:pStyle w:val="Heading2"/>
+      </w:pPr>
+      <w:bookmarkStart w:id="18" w:name="διακομιστής-ιστορικού"/>
+      <w:bookmarkStart w:id="19" w:name="_Toc227829469"/>
+      <w:r>
         <w:t>Διακομιστής ιστορικού</w:t>
       </w:r>
-      <w:r>
-        <w:t xml:space="preserve">: Το Apache Spark έχει μια χρήσιμη υπηρεσία που αποθηκεύει όλα τα αρχεία καταγραφής από όλους τους κόμβους, δηλαδή από τον master και τους worker, για όλες τις εργασίες που έχουν υποβληθεί. Σε αυτή την εκδοχή της στοίβας, ο διακομιστής ιστορικού τρέχει ως ξεχωριστός περιέκτης </w:t>
+      <w:bookmarkEnd w:id="19"/>
+    </w:p>
+    <w:p>
+      <w:r>
+        <w:t xml:space="preserve">Το Apache Spark έχει μια χρήσιμη υπηρεσία που αποθηκεύει όλα τα αρχεία καταγραφής από όλους τους κόμβους, δηλαδή από τον master και τους worker, για όλες τις εργασίες που έχουν υποβληθεί. Σε αυτή την εκδοχή της στοίβας, ο διακομιστής ιστορικού τρέχει ως ξεχωριστός περιέκτης </w:t>
       </w:r>
       <w:r>
         <w:rPr>
@@ -10291,7 +10366,7 @@
         </w:rPr>
         <w:lastRenderedPageBreak/>
         <w:drawing>
-          <wp:inline distT="0" distB="0" distL="0" distR="0" wp14:anchorId="2523583D" wp14:editId="57FCF46D">
+          <wp:inline distT="0" distB="0" distL="0" distR="0" wp14:anchorId="6849353B" wp14:editId="5B8C17F6">
             <wp:extent cx="6692900" cy="3307628"/>
             <wp:effectExtent l="0" t="0" r="0" b="0"/>
             <wp:docPr id="96" name="Picture" descr="Εικόνα 22"/>
@@ -10342,7 +10417,7 @@
           <w:noProof/>
         </w:rPr>
         <w:drawing>
-          <wp:inline distT="0" distB="0" distL="0" distR="0" wp14:anchorId="1E39D264" wp14:editId="2B49032C">
+          <wp:inline distT="0" distB="0" distL="0" distR="0" wp14:anchorId="2880180D" wp14:editId="552782D6">
             <wp:extent cx="6692900" cy="4050863"/>
             <wp:effectExtent l="0" t="0" r="0" b="0"/>
             <wp:docPr id="99" name="Picture" descr="Εικόνα 23"/>
@@ -10891,13 +10966,14 @@
       <w:pPr>
         <w:pStyle w:val="Heading1"/>
       </w:pPr>
-      <w:bookmarkStart w:id="18" w:name="τερματισμός-και-καθαρισμός-υποδομής"/>
-      <w:bookmarkStart w:id="19" w:name="_Toc227785280"/>
+      <w:bookmarkStart w:id="20" w:name="τερματισμός-και-καθαρισμός-υποδομής"/>
+      <w:bookmarkStart w:id="21" w:name="_Toc227829470"/>
       <w:bookmarkEnd w:id="16"/>
+      <w:bookmarkEnd w:id="18"/>
       <w:r>
         <w:t>Τερματισμός και καθαρισμός υποδομής</w:t>
       </w:r>
-      <w:bookmarkEnd w:id="19"/>
+      <w:bookmarkEnd w:id="21"/>
     </w:p>
     <w:p>
       <w:r>
@@ -11062,7 +11138,7 @@
       <w:r>
         <w:t>, θα ξεκινήσετε από καθαρή κατάσταση και η αρχικοποίηση του HDFS θα γίνει ξανά αυτόματα.</w:t>
       </w:r>
-      <w:bookmarkEnd w:id="18"/>
+      <w:bookmarkEnd w:id="20"/>
     </w:p>
     <w:sectPr>
       <w:headerReference w:type="default" r:id="rId31"/>
@@ -11493,7 +11569,7 @@
   <w:abstractNum w:abstractNumId="9" w15:restartNumberingAfterBreak="0">
     <w:nsid w:val="0000A990"/>
     <w:multiLevelType w:val="multilevel"/>
-    <w:tmpl w:val="4612815A"/>
+    <w:tmpl w:val="3BDCCCBA"/>
     <w:lvl w:ilvl="0">
       <w:numFmt w:val="bullet"/>
       <w:lvlText w:val=" "/>
@@ -11570,7 +11646,7 @@
   <w:abstractNum w:abstractNumId="10" w15:restartNumberingAfterBreak="0">
     <w:nsid w:val="0000A991"/>
     <w:multiLevelType w:val="multilevel"/>
-    <w:tmpl w:val="D340E6D8"/>
+    <w:tmpl w:val="7AEE8E2A"/>
     <w:lvl w:ilvl="0">
       <w:numFmt w:val="bullet"/>
       <w:lvlText w:val=""/>
@@ -11671,94 +11747,94 @@
       </w:rPr>
     </w:lvl>
   </w:abstractNum>
-  <w:num w:numId="1" w16cid:durableId="1496333908">
+  <w:num w:numId="1" w16cid:durableId="977607177">
     <w:abstractNumId w:val="8"/>
   </w:num>
-  <w:num w:numId="2" w16cid:durableId="1311784604">
+  <w:num w:numId="2" w16cid:durableId="713235722">
     <w:abstractNumId w:val="6"/>
   </w:num>
-  <w:num w:numId="3" w16cid:durableId="797063528">
+  <w:num w:numId="3" w16cid:durableId="398792495">
     <w:abstractNumId w:val="5"/>
   </w:num>
-  <w:num w:numId="4" w16cid:durableId="1414082378">
+  <w:num w:numId="4" w16cid:durableId="1535464392">
     <w:abstractNumId w:val="4"/>
   </w:num>
-  <w:num w:numId="5" w16cid:durableId="392391660">
+  <w:num w:numId="5" w16cid:durableId="745765500">
     <w:abstractNumId w:val="7"/>
   </w:num>
-  <w:num w:numId="6" w16cid:durableId="533545325">
+  <w:num w:numId="6" w16cid:durableId="553351189">
     <w:abstractNumId w:val="3"/>
   </w:num>
-  <w:num w:numId="7" w16cid:durableId="725102839">
+  <w:num w:numId="7" w16cid:durableId="1669558688">
     <w:abstractNumId w:val="2"/>
   </w:num>
-  <w:num w:numId="8" w16cid:durableId="1376856625">
+  <w:num w:numId="8" w16cid:durableId="425422374">
     <w:abstractNumId w:val="1"/>
   </w:num>
-  <w:num w:numId="9" w16cid:durableId="1659766532">
+  <w:num w:numId="9" w16cid:durableId="1697190180">
     <w:abstractNumId w:val="0"/>
   </w:num>
-  <w:num w:numId="10" w16cid:durableId="2040083929">
+  <w:num w:numId="10" w16cid:durableId="210656276">
     <w:abstractNumId w:val="9"/>
   </w:num>
-  <w:num w:numId="11" w16cid:durableId="1248734717">
+  <w:num w:numId="11" w16cid:durableId="317466818">
     <w:abstractNumId w:val="10"/>
   </w:num>
-  <w:num w:numId="12" w16cid:durableId="2111392815">
+  <w:num w:numId="12" w16cid:durableId="684675671">
     <w:abstractNumId w:val="10"/>
   </w:num>
-  <w:num w:numId="13" w16cid:durableId="2116710310">
+  <w:num w:numId="13" w16cid:durableId="407726966">
     <w:abstractNumId w:val="10"/>
   </w:num>
-  <w:num w:numId="14" w16cid:durableId="1189641888">
+  <w:num w:numId="14" w16cid:durableId="1066494480">
     <w:abstractNumId w:val="10"/>
   </w:num>
-  <w:num w:numId="15" w16cid:durableId="1474638765">
+  <w:num w:numId="15" w16cid:durableId="1344937841">
     <w:abstractNumId w:val="10"/>
   </w:num>
-  <w:num w:numId="16" w16cid:durableId="248852112">
+  <w:num w:numId="16" w16cid:durableId="1857429090">
     <w:abstractNumId w:val="10"/>
   </w:num>
-  <w:num w:numId="17" w16cid:durableId="1678268606">
+  <w:num w:numId="17" w16cid:durableId="617640510">
     <w:abstractNumId w:val="10"/>
   </w:num>
-  <w:num w:numId="18" w16cid:durableId="1248810746">
+  <w:num w:numId="18" w16cid:durableId="669678860">
     <w:abstractNumId w:val="10"/>
   </w:num>
-  <w:num w:numId="19" w16cid:durableId="766727611">
+  <w:num w:numId="19" w16cid:durableId="1418477669">
     <w:abstractNumId w:val="10"/>
   </w:num>
-  <w:num w:numId="20" w16cid:durableId="1436171315">
+  <w:num w:numId="20" w16cid:durableId="596863037">
     <w:abstractNumId w:val="10"/>
   </w:num>
-  <w:num w:numId="21" w16cid:durableId="175509174">
+  <w:num w:numId="21" w16cid:durableId="901596537">
     <w:abstractNumId w:val="10"/>
   </w:num>
-  <w:num w:numId="22" w16cid:durableId="1755004430">
+  <w:num w:numId="22" w16cid:durableId="2133552691">
     <w:abstractNumId w:val="10"/>
   </w:num>
-  <w:num w:numId="23" w16cid:durableId="1264798157">
+  <w:num w:numId="23" w16cid:durableId="858931820">
     <w:abstractNumId w:val="10"/>
   </w:num>
-  <w:num w:numId="24" w16cid:durableId="2052225424">
+  <w:num w:numId="24" w16cid:durableId="1812408779">
     <w:abstractNumId w:val="10"/>
   </w:num>
-  <w:num w:numId="25" w16cid:durableId="1730180660">
+  <w:num w:numId="25" w16cid:durableId="81142878">
     <w:abstractNumId w:val="10"/>
   </w:num>
-  <w:num w:numId="26" w16cid:durableId="74085455">
+  <w:num w:numId="26" w16cid:durableId="1194808400">
     <w:abstractNumId w:val="10"/>
   </w:num>
-  <w:num w:numId="27" w16cid:durableId="1455178141">
+  <w:num w:numId="27" w16cid:durableId="1843659757">
     <w:abstractNumId w:val="10"/>
   </w:num>
-  <w:num w:numId="28" w16cid:durableId="1285843790">
+  <w:num w:numId="28" w16cid:durableId="1090004159">
     <w:abstractNumId w:val="10"/>
   </w:num>
-  <w:num w:numId="29" w16cid:durableId="1471903022">
+  <w:num w:numId="29" w16cid:durableId="450978407">
     <w:abstractNumId w:val="10"/>
   </w:num>
-  <w:num w:numId="30" w16cid:durableId="847409608">
+  <w:num w:numId="30" w16cid:durableId="1009792451">
     <w:abstractNumId w:val="10"/>
   </w:num>
 </w:numbering>
@@ -23579,7 +23655,7 @@
     <w:autoRedefine/>
     <w:uiPriority w:val="39"/>
     <w:unhideWhenUsed/>
-    <w:rsid w:val="00501F90"/>
+    <w:rsid w:val="00F177D2"/>
     <w:pPr>
       <w:spacing w:after="100"/>
     </w:pPr>
@@ -23591,7 +23667,7 @@
     <w:autoRedefine/>
     <w:uiPriority w:val="39"/>
     <w:unhideWhenUsed/>
-    <w:rsid w:val="00501F90"/>
+    <w:rsid w:val="00F177D2"/>
     <w:pPr>
       <w:spacing w:after="100"/>
       <w:ind w:left="220"/>
@@ -23602,7 +23678,7 @@
     <w:basedOn w:val="DefaultParagraphFont"/>
     <w:uiPriority w:val="99"/>
     <w:unhideWhenUsed/>
-    <w:rsid w:val="00501F90"/>
+    <w:rsid w:val="00F177D2"/>
     <w:rPr>
       <w:color w:val="0000FF" w:themeColor="hyperlink"/>
       <w:u w:val="single"/>

</xml_diff>

<commit_message>
Refresh 06 docx after heading update
</commit_message>
<xml_diff>
--- a/odigoi/06_local_cluster_infrastructure_docker.docx
+++ b/odigoi/06_local_cluster_infrastructure_docker.docx
@@ -20,7 +20,7 @@
           <w:sz w:val="22"/>
           <w:szCs w:val="22"/>
         </w:rPr>
-        <w:id w:val="-142971066"/>
+        <w:id w:val="-366445447"/>
         <w:docPartObj>
           <w:docPartGallery w:val="Table of Contents"/>
           <w:docPartUnique/>
@@ -61,7 +61,7 @@
           <w:r>
             <w:fldChar w:fldCharType="separate"/>
           </w:r>
-          <w:hyperlink w:anchor="_Toc227829460" w:history="1">
+          <w:hyperlink w:anchor="_Toc227843708" w:history="1">
             <w:r>
               <w:rPr>
                 <w:rStyle w:val="Hyperlink"/>
@@ -88,7 +88,7 @@
                 <w:noProof/>
                 <w:webHidden/>
               </w:rPr>
-              <w:instrText xml:space="preserve"> PAGEREF _Toc227829460 \h </w:instrText>
+              <w:instrText xml:space="preserve"> PAGEREF _Toc227843708 \h </w:instrText>
             </w:r>
             <w:r>
               <w:rPr>
@@ -135,7 +135,7 @@
               <w14:ligatures w14:val="standardContextual"/>
             </w:rPr>
           </w:pPr>
-          <w:hyperlink w:anchor="_Toc227829461" w:history="1">
+          <w:hyperlink w:anchor="_Toc227843709" w:history="1">
             <w:r>
               <w:rPr>
                 <w:rStyle w:val="Hyperlink"/>
@@ -162,7 +162,7 @@
                 <w:noProof/>
                 <w:webHidden/>
               </w:rPr>
-              <w:instrText xml:space="preserve"> PAGEREF _Toc227829461 \h </w:instrText>
+              <w:instrText xml:space="preserve"> PAGEREF _Toc227843709 \h </w:instrText>
             </w:r>
             <w:r>
               <w:rPr>
@@ -209,7 +209,7 @@
               <w14:ligatures w14:val="standardContextual"/>
             </w:rPr>
           </w:pPr>
-          <w:hyperlink w:anchor="_Toc227829462" w:history="1">
+          <w:hyperlink w:anchor="_Toc227843710" w:history="1">
             <w:r>
               <w:rPr>
                 <w:rStyle w:val="Hyperlink"/>
@@ -236,7 +236,7 @@
                 <w:noProof/>
                 <w:webHidden/>
               </w:rPr>
-              <w:instrText xml:space="preserve"> PAGEREF _Toc227829462 \h </w:instrText>
+              <w:instrText xml:space="preserve"> PAGEREF _Toc227843710 \h </w:instrText>
             </w:r>
             <w:r>
               <w:rPr>
@@ -283,7 +283,7 @@
               <w14:ligatures w14:val="standardContextual"/>
             </w:rPr>
           </w:pPr>
-          <w:hyperlink w:anchor="_Toc227829463" w:history="1">
+          <w:hyperlink w:anchor="_Toc227843711" w:history="1">
             <w:r>
               <w:rPr>
                 <w:rStyle w:val="Hyperlink"/>
@@ -310,7 +310,7 @@
                 <w:noProof/>
                 <w:webHidden/>
               </w:rPr>
-              <w:instrText xml:space="preserve"> PAGEREF _Toc227829463 \h </w:instrText>
+              <w:instrText xml:space="preserve"> PAGEREF _Toc227843711 \h </w:instrText>
             </w:r>
             <w:r>
               <w:rPr>
@@ -357,7 +357,7 @@
               <w14:ligatures w14:val="standardContextual"/>
             </w:rPr>
           </w:pPr>
-          <w:hyperlink w:anchor="_Toc227829464" w:history="1">
+          <w:hyperlink w:anchor="_Toc227843712" w:history="1">
             <w:r>
               <w:rPr>
                 <w:rStyle w:val="Hyperlink"/>
@@ -384,7 +384,7 @@
                 <w:noProof/>
                 <w:webHidden/>
               </w:rPr>
-              <w:instrText xml:space="preserve"> PAGEREF _Toc227829464 \h </w:instrText>
+              <w:instrText xml:space="preserve"> PAGEREF _Toc227843712 \h </w:instrText>
             </w:r>
             <w:r>
               <w:rPr>
@@ -431,7 +431,7 @@
               <w14:ligatures w14:val="standardContextual"/>
             </w:rPr>
           </w:pPr>
-          <w:hyperlink w:anchor="_Toc227829465" w:history="1">
+          <w:hyperlink w:anchor="_Toc227843713" w:history="1">
             <w:r>
               <w:rPr>
                 <w:rStyle w:val="Hyperlink"/>
@@ -458,7 +458,7 @@
                 <w:noProof/>
                 <w:webHidden/>
               </w:rPr>
-              <w:instrText xml:space="preserve"> PAGEREF _Toc227829465 \h </w:instrText>
+              <w:instrText xml:space="preserve"> PAGEREF _Toc227843713 \h </w:instrText>
             </w:r>
             <w:r>
               <w:rPr>
@@ -505,7 +505,7 @@
               <w14:ligatures w14:val="standardContextual"/>
             </w:rPr>
           </w:pPr>
-          <w:hyperlink w:anchor="_Toc227829466" w:history="1">
+          <w:hyperlink w:anchor="_Toc227843714" w:history="1">
             <w:r>
               <w:rPr>
                 <w:rStyle w:val="Hyperlink"/>
@@ -532,7 +532,7 @@
                 <w:noProof/>
                 <w:webHidden/>
               </w:rPr>
-              <w:instrText xml:space="preserve"> PAGEREF _Toc227829466 \h </w:instrText>
+              <w:instrText xml:space="preserve"> PAGEREF _Toc227843714 \h </w:instrText>
             </w:r>
             <w:r>
               <w:rPr>
@@ -579,7 +579,7 @@
               <w14:ligatures w14:val="standardContextual"/>
             </w:rPr>
           </w:pPr>
-          <w:hyperlink w:anchor="_Toc227829467" w:history="1">
+          <w:hyperlink w:anchor="_Toc227843715" w:history="1">
             <w:r>
               <w:rPr>
                 <w:rStyle w:val="Hyperlink"/>
@@ -606,7 +606,7 @@
                 <w:noProof/>
                 <w:webHidden/>
               </w:rPr>
-              <w:instrText xml:space="preserve"> PAGEREF _Toc227829467 \h </w:instrText>
+              <w:instrText xml:space="preserve"> PAGEREF _Toc227843715 \h </w:instrText>
             </w:r>
             <w:r>
               <w:rPr>
@@ -653,7 +653,7 @@
               <w14:ligatures w14:val="standardContextual"/>
             </w:rPr>
           </w:pPr>
-          <w:hyperlink w:anchor="_Toc227829468" w:history="1">
+          <w:hyperlink w:anchor="_Toc227843716" w:history="1">
             <w:r>
               <w:rPr>
                 <w:rStyle w:val="Hyperlink"/>
@@ -680,7 +680,7 @@
                 <w:noProof/>
                 <w:webHidden/>
               </w:rPr>
-              <w:instrText xml:space="preserve"> PAGEREF _Toc227829468 \h </w:instrText>
+              <w:instrText xml:space="preserve"> PAGEREF _Toc227843716 \h </w:instrText>
             </w:r>
             <w:r>
               <w:rPr>
@@ -713,7 +713,7 @@
         </w:p>
         <w:p>
           <w:pPr>
-            <w:pStyle w:val="TOC2"/>
+            <w:pStyle w:val="TOC1"/>
             <w:tabs>
               <w:tab w:val="right" w:leader="dot" w:pos="10530"/>
             </w:tabs>
@@ -727,7 +727,7 @@
               <w14:ligatures w14:val="standardContextual"/>
             </w:rPr>
           </w:pPr>
-          <w:hyperlink w:anchor="_Toc227829469" w:history="1">
+          <w:hyperlink w:anchor="_Toc227843717" w:history="1">
             <w:r>
               <w:rPr>
                 <w:rStyle w:val="Hyperlink"/>
@@ -754,7 +754,7 @@
                 <w:noProof/>
                 <w:webHidden/>
               </w:rPr>
-              <w:instrText xml:space="preserve"> PAGEREF _Toc227829469 \h </w:instrText>
+              <w:instrText xml:space="preserve"> PAGEREF _Toc227843717 \h </w:instrText>
             </w:r>
             <w:r>
               <w:rPr>
@@ -801,7 +801,7 @@
               <w14:ligatures w14:val="standardContextual"/>
             </w:rPr>
           </w:pPr>
-          <w:hyperlink w:anchor="_Toc227829470" w:history="1">
+          <w:hyperlink w:anchor="_Toc227843718" w:history="1">
             <w:r>
               <w:rPr>
                 <w:rStyle w:val="Hyperlink"/>
@@ -828,7 +828,7 @@
                 <w:noProof/>
                 <w:webHidden/>
               </w:rPr>
-              <w:instrText xml:space="preserve"> PAGEREF _Toc227829470 \h </w:instrText>
+              <w:instrText xml:space="preserve"> PAGEREF _Toc227843718 \h </w:instrText>
             </w:r>
             <w:r>
               <w:rPr>
@@ -969,7 +969,7 @@
         <w:pStyle w:val="Heading1"/>
       </w:pPr>
       <w:bookmarkStart w:id="0" w:name="προέλεγχος-docker-στο-wsl"/>
-      <w:bookmarkStart w:id="1" w:name="_Toc227829460"/>
+      <w:bookmarkStart w:id="1" w:name="_Toc227843708"/>
       <w:r>
         <w:t>Προέλεγχος Docker στο WSL</w:t>
       </w:r>
@@ -1113,7 +1113,7 @@
         <w:pStyle w:val="Heading1"/>
       </w:pPr>
       <w:bookmarkStart w:id="2" w:name="αρχιτεκτονική-hdfs-και-spark"/>
-      <w:bookmarkStart w:id="3" w:name="_Toc227829461"/>
+      <w:bookmarkStart w:id="3" w:name="_Toc227843709"/>
       <w:bookmarkEnd w:id="0"/>
       <w:r>
         <w:t>Αρχιτεκτονική HDFS και Spark</w:t>
@@ -1144,7 +1144,7 @@
           <w:noProof/>
         </w:rPr>
         <w:drawing>
-          <wp:inline distT="0" distB="0" distL="0" distR="0" wp14:anchorId="75002A96" wp14:editId="226EB49B">
+          <wp:inline distT="0" distB="0" distL="0" distR="0" wp14:anchorId="6143EF41" wp14:editId="063E6F40">
             <wp:extent cx="6692900" cy="4625299"/>
             <wp:effectExtent l="0" t="0" r="0" b="0"/>
             <wp:docPr id="23" name="Picture" descr="Εικόνα 1"/>
@@ -1247,7 +1247,7 @@
         </w:rPr>
         <w:lastRenderedPageBreak/>
         <w:drawing>
-          <wp:inline distT="0" distB="0" distL="0" distR="0" wp14:anchorId="0C135862" wp14:editId="5D32524F">
+          <wp:inline distT="0" distB="0" distL="0" distR="0" wp14:anchorId="243EAD8A" wp14:editId="13943EF5">
             <wp:extent cx="6680200" cy="4470400"/>
             <wp:effectExtent l="0" t="0" r="0" b="0"/>
             <wp:docPr id="26" name="Picture" descr="Εικόνα 2"/>
@@ -1298,7 +1298,7 @@
           <w:noProof/>
         </w:rPr>
         <w:drawing>
-          <wp:inline distT="0" distB="0" distL="0" distR="0" wp14:anchorId="6E8C8F11" wp14:editId="21596E5F">
+          <wp:inline distT="0" distB="0" distL="0" distR="0" wp14:anchorId="393FFCD8" wp14:editId="66D3BB04">
             <wp:extent cx="6692900" cy="3111152"/>
             <wp:effectExtent l="0" t="0" r="0" b="0"/>
             <wp:docPr id="29" name="Picture" descr="Εικόνα 3"/>
@@ -1403,7 +1403,7 @@
         <w:pStyle w:val="Heading1"/>
       </w:pPr>
       <w:bookmarkStart w:id="4" w:name="βασικές-έννοιες-docker"/>
-      <w:bookmarkStart w:id="5" w:name="_Toc227829462"/>
+      <w:bookmarkStart w:id="5" w:name="_Toc227843710"/>
       <w:bookmarkEnd w:id="2"/>
       <w:r>
         <w:t>Βασικές έννοιες Docker</w:t>
@@ -1821,7 +1821,7 @@
           <w:noProof/>
         </w:rPr>
         <w:drawing>
-          <wp:inline distT="0" distB="0" distL="0" distR="0" wp14:anchorId="7EEBFB43" wp14:editId="3E1347DB">
+          <wp:inline distT="0" distB="0" distL="0" distR="0" wp14:anchorId="63BA6C68" wp14:editId="01DDB777">
             <wp:extent cx="6692900" cy="2040481"/>
             <wp:effectExtent l="0" t="0" r="0" b="0"/>
             <wp:docPr id="33" name="Picture" descr="Εικόνα 4"/>
@@ -1895,7 +1895,7 @@
           <w:noProof/>
         </w:rPr>
         <w:drawing>
-          <wp:inline distT="0" distB="0" distL="0" distR="0" wp14:anchorId="04B8629F" wp14:editId="30AC1ADF">
+          <wp:inline distT="0" distB="0" distL="0" distR="0" wp14:anchorId="31D3F000" wp14:editId="2AAB0A71">
             <wp:extent cx="5707781" cy="346509"/>
             <wp:effectExtent l="0" t="0" r="0" b="0"/>
             <wp:docPr id="36" name="Picture" descr="Εικόνα 5"/>
@@ -2025,7 +2025,7 @@
         <w:pStyle w:val="Heading1"/>
       </w:pPr>
       <w:bookmarkStart w:id="6" w:name="Xea4649a608c1d80704b1c93c78a1c2b4da6dc26"/>
-      <w:bookmarkStart w:id="7" w:name="_Toc227829463"/>
+      <w:bookmarkStart w:id="7" w:name="_Toc227843711"/>
       <w:bookmarkEnd w:id="4"/>
       <w:r>
         <w:t>Δημιουργία τοπικής συστοιχίας Apache Spark και HDFS με περιέκτες Docker</w:t>
@@ -2394,7 +2394,7 @@
         <w:pStyle w:val="Heading1"/>
       </w:pPr>
       <w:bookmarkStart w:id="8" w:name="πώς-συνδέονται-οι-υπηρεσίες-μεταξύ-τους"/>
-      <w:bookmarkStart w:id="9" w:name="_Toc227829464"/>
+      <w:bookmarkStart w:id="9" w:name="_Toc227843712"/>
       <w:bookmarkEnd w:id="6"/>
       <w:r>
         <w:t>Πώς συνδέονται οι υπηρεσίες μεταξύ τους</w:t>
@@ -2868,7 +2868,7 @@
         </w:rPr>
         <w:lastRenderedPageBreak/>
         <w:drawing>
-          <wp:inline distT="0" distB="0" distL="0" distR="0" wp14:anchorId="558F9DD3" wp14:editId="01A68611">
+          <wp:inline distT="0" distB="0" distL="0" distR="0" wp14:anchorId="7EBC64BE" wp14:editId="1C71C91B">
             <wp:extent cx="6692900" cy="3291679"/>
             <wp:effectExtent l="0" t="0" r="0" b="0"/>
             <wp:docPr id="41" name="Picture" descr="Εικόνα 6"/>
@@ -2941,7 +2941,7 @@
           <w:noProof/>
         </w:rPr>
         <w:drawing>
-          <wp:inline distT="0" distB="0" distL="0" distR="0" wp14:anchorId="6C71E88E" wp14:editId="68F37A22">
+          <wp:inline distT="0" distB="0" distL="0" distR="0" wp14:anchorId="543CE2DB" wp14:editId="3ED7C16D">
             <wp:extent cx="6692900" cy="788569"/>
             <wp:effectExtent l="0" t="0" r="0" b="0"/>
             <wp:docPr id="44" name="Picture" descr="Εικόνα 7"/>
@@ -3010,7 +3010,7 @@
         </w:rPr>
         <w:lastRenderedPageBreak/>
         <w:drawing>
-          <wp:inline distT="0" distB="0" distL="0" distR="0" wp14:anchorId="5FA15AF8" wp14:editId="4C2BB628">
+          <wp:inline distT="0" distB="0" distL="0" distR="0" wp14:anchorId="76245294" wp14:editId="6A80EBC1">
             <wp:extent cx="6438900" cy="10591800"/>
             <wp:effectExtent l="0" t="0" r="0" b="0"/>
             <wp:docPr id="47" name="Picture" descr="Εικόνα 8"/>
@@ -3134,7 +3134,7 @@
         </w:rPr>
         <w:lastRenderedPageBreak/>
         <w:drawing>
-          <wp:inline distT="0" distB="0" distL="0" distR="0" wp14:anchorId="43F8031C" wp14:editId="1C9C1633">
+          <wp:inline distT="0" distB="0" distL="0" distR="0" wp14:anchorId="6EE12BD8" wp14:editId="4F5BEA6A">
             <wp:extent cx="6692900" cy="7709300"/>
             <wp:effectExtent l="0" t="0" r="0" b="0"/>
             <wp:docPr id="50" name="Picture" descr="Εικόνα 9"/>
@@ -3265,7 +3265,7 @@
           <w:noProof/>
         </w:rPr>
         <w:drawing>
-          <wp:inline distT="0" distB="0" distL="0" distR="0" wp14:anchorId="2B0C71E1" wp14:editId="177985EE">
+          <wp:inline distT="0" distB="0" distL="0" distR="0" wp14:anchorId="143CC28C" wp14:editId="7A0026C2">
             <wp:extent cx="6692900" cy="5648755"/>
             <wp:effectExtent l="0" t="0" r="0" b="0"/>
             <wp:docPr id="53" name="Picture" descr="Εικόνα 10"/>
@@ -3353,7 +3353,7 @@
         </w:rPr>
         <w:lastRenderedPageBreak/>
         <w:drawing>
-          <wp:inline distT="0" distB="0" distL="0" distR="0" wp14:anchorId="2C13AFFD" wp14:editId="0A533D0D">
+          <wp:inline distT="0" distB="0" distL="0" distR="0" wp14:anchorId="72DBDFA1" wp14:editId="781F06C4">
             <wp:extent cx="6692900" cy="3630867"/>
             <wp:effectExtent l="0" t="0" r="0" b="0"/>
             <wp:docPr id="56" name="Picture" descr="Εικόνα 11"/>
@@ -3426,7 +3426,7 @@
           <w:noProof/>
         </w:rPr>
         <w:drawing>
-          <wp:inline distT="0" distB="0" distL="0" distR="0" wp14:anchorId="3659E1C8" wp14:editId="31378921">
+          <wp:inline distT="0" distB="0" distL="0" distR="0" wp14:anchorId="595380F7" wp14:editId="738775FE">
             <wp:extent cx="6429675" cy="1761423"/>
             <wp:effectExtent l="0" t="0" r="0" b="0"/>
             <wp:docPr id="59" name="Picture" descr="Εικόνα 12"/>
@@ -3481,7 +3481,7 @@
         <w:pStyle w:val="Heading2"/>
       </w:pPr>
       <w:bookmarkStart w:id="10" w:name="αν-χρησιμοποιείτε-docker-desktop"/>
-      <w:bookmarkStart w:id="11" w:name="_Toc227829465"/>
+      <w:bookmarkStart w:id="11" w:name="_Toc227843713"/>
       <w:r>
         <w:t>Αν χρησιμοποιείτε Docker Desktop</w:t>
       </w:r>
@@ -3519,7 +3519,7 @@
         </w:rPr>
         <w:lastRenderedPageBreak/>
         <w:drawing>
-          <wp:inline distT="0" distB="0" distL="0" distR="0" wp14:anchorId="3A9477CD" wp14:editId="6CC4D1E1">
+          <wp:inline distT="0" distB="0" distL="0" distR="0" wp14:anchorId="2EC6918D" wp14:editId="12CAA6DE">
             <wp:extent cx="2483317" cy="6477802"/>
             <wp:effectExtent l="0" t="0" r="0" b="0"/>
             <wp:docPr id="62" name="Picture" descr="Εικόνα 13"/>
@@ -3610,7 +3610,7 @@
           <w:noProof/>
         </w:rPr>
         <w:drawing>
-          <wp:inline distT="0" distB="0" distL="0" distR="0" wp14:anchorId="55B49FD8" wp14:editId="0D650C18">
+          <wp:inline distT="0" distB="0" distL="0" distR="0" wp14:anchorId="0370418F" wp14:editId="048FB331">
             <wp:extent cx="6692900" cy="1923612"/>
             <wp:effectExtent l="0" t="0" r="0" b="0"/>
             <wp:docPr id="65" name="Picture" descr="Εικόνα 14"/>
@@ -3747,7 +3747,7 @@
           <w:noProof/>
         </w:rPr>
         <w:drawing>
-          <wp:inline distT="0" distB="0" distL="0" distR="0" wp14:anchorId="788DBA66" wp14:editId="7034D868">
+          <wp:inline distT="0" distB="0" distL="0" distR="0" wp14:anchorId="17DA00AC" wp14:editId="21587DDC">
             <wp:extent cx="6692900" cy="2360127"/>
             <wp:effectExtent l="0" t="0" r="0" b="0"/>
             <wp:docPr id="68" name="Picture" descr="Εικόνα 15"/>
@@ -3794,7 +3794,7 @@
         <w:pStyle w:val="Heading2"/>
       </w:pPr>
       <w:bookmarkStart w:id="12" w:name="Xbd2e785ab500aaf081e610b0667b69cb3736269"/>
-      <w:bookmarkStart w:id="13" w:name="_Toc227829466"/>
+      <w:bookmarkStart w:id="13" w:name="_Toc227843714"/>
       <w:bookmarkEnd w:id="10"/>
       <w:r>
         <w:t>Αν χρησιμοποιείτε αυτόνομο Docker Engine μέσα στο WSL</w:t>
@@ -5959,7 +5959,7 @@
           <w:noProof/>
         </w:rPr>
         <w:drawing>
-          <wp:inline distT="0" distB="0" distL="0" distR="0" wp14:anchorId="365F09A3" wp14:editId="770195CB">
+          <wp:inline distT="0" distB="0" distL="0" distR="0" wp14:anchorId="5AE11D50" wp14:editId="092E6F57">
             <wp:extent cx="6692900" cy="3823835"/>
             <wp:effectExtent l="0" t="0" r="0" b="0"/>
             <wp:docPr id="72" name="Picture" descr="Εικόνα 16"/>
@@ -6006,7 +6006,7 @@
         <w:pStyle w:val="Heading1"/>
       </w:pPr>
       <w:bookmarkStart w:id="14" w:name="εκτέλεση-προγραμμάτων-στη-συστοιχία"/>
-      <w:bookmarkStart w:id="15" w:name="_Toc227829467"/>
+      <w:bookmarkStart w:id="15" w:name="_Toc227843715"/>
       <w:bookmarkEnd w:id="8"/>
       <w:bookmarkEnd w:id="12"/>
       <w:r>
@@ -6171,7 +6171,7 @@
           <w:noProof/>
         </w:rPr>
         <w:drawing>
-          <wp:inline distT="0" distB="0" distL="0" distR="0" wp14:anchorId="12DC75F3" wp14:editId="2EA59FA7">
+          <wp:inline distT="0" distB="0" distL="0" distR="0" wp14:anchorId="557217F3" wp14:editId="150D99B9">
             <wp:extent cx="6692900" cy="1101215"/>
             <wp:effectExtent l="0" t="0" r="0" b="0"/>
             <wp:docPr id="77" name="Picture" descr="Εικόνα 17"/>
@@ -6244,7 +6244,7 @@
           <w:noProof/>
         </w:rPr>
         <w:drawing>
-          <wp:inline distT="0" distB="0" distL="0" distR="0" wp14:anchorId="22EAA23C" wp14:editId="1E5EA619">
+          <wp:inline distT="0" distB="0" distL="0" distR="0" wp14:anchorId="45CF1CE2" wp14:editId="3593D94D">
             <wp:extent cx="6692900" cy="1722842"/>
             <wp:effectExtent l="0" t="0" r="0" b="0"/>
             <wp:docPr id="80" name="Picture" descr="Εικόνα 18"/>
@@ -6344,7 +6344,7 @@
           <w:noProof/>
         </w:rPr>
         <w:drawing>
-          <wp:inline distT="0" distB="0" distL="0" distR="0" wp14:anchorId="3016DFCE" wp14:editId="7894A9B0">
+          <wp:inline distT="0" distB="0" distL="0" distR="0" wp14:anchorId="04043897" wp14:editId="30FBB5A0">
             <wp:extent cx="6692900" cy="397769"/>
             <wp:effectExtent l="0" t="0" r="0" b="0"/>
             <wp:docPr id="83" name="Picture" descr="Εικόνα 24"/>
@@ -9168,7 +9168,7 @@
           <w:noProof/>
         </w:rPr>
         <w:drawing>
-          <wp:inline distT="0" distB="0" distL="0" distR="0" wp14:anchorId="7A3ECC8E" wp14:editId="563A5B18">
+          <wp:inline distT="0" distB="0" distL="0" distR="0" wp14:anchorId="43737A84" wp14:editId="402FE70E">
             <wp:extent cx="6692900" cy="1694227"/>
             <wp:effectExtent l="0" t="0" r="0" b="0"/>
             <wp:docPr id="86" name="Picture" descr="Εικόνα 19"/>
@@ -9280,7 +9280,7 @@
           <w:noProof/>
         </w:rPr>
         <w:drawing>
-          <wp:inline distT="0" distB="0" distL="0" distR="0" wp14:anchorId="17C59D22" wp14:editId="1329ED08">
+          <wp:inline distT="0" distB="0" distL="0" distR="0" wp14:anchorId="08BFDA68" wp14:editId="432A84D9">
             <wp:extent cx="6692900" cy="761605"/>
             <wp:effectExtent l="0" t="0" r="0" b="0"/>
             <wp:docPr id="89" name="Picture" descr="Εικόνα 20"/>
@@ -9679,7 +9679,7 @@
         <w:pStyle w:val="Heading1"/>
       </w:pPr>
       <w:bookmarkStart w:id="16" w:name="X7a168f6e489465ead18c75b7f02ad077304a52f"/>
-      <w:bookmarkStart w:id="17" w:name="_Toc227829468"/>
+      <w:bookmarkStart w:id="17" w:name="_Toc227843716"/>
       <w:bookmarkEnd w:id="14"/>
       <w:r>
         <w:lastRenderedPageBreak/>
@@ -10289,7 +10289,7 @@
           <w:noProof/>
         </w:rPr>
         <w:drawing>
-          <wp:inline distT="0" distB="0" distL="0" distR="0" wp14:anchorId="4A7710EA" wp14:editId="54D0C603">
+          <wp:inline distT="0" distB="0" distL="0" distR="0" wp14:anchorId="51375418" wp14:editId="52A1FFB3">
             <wp:extent cx="6692900" cy="6026364"/>
             <wp:effectExtent l="0" t="0" r="0" b="0"/>
             <wp:docPr id="93" name="Picture" descr="Εικόνα 21"/>
@@ -10333,10 +10333,11 @@
     </w:p>
     <w:p>
       <w:pPr>
-        <w:pStyle w:val="Heading2"/>
+        <w:pStyle w:val="Heading1"/>
       </w:pPr>
       <w:bookmarkStart w:id="18" w:name="διακομιστής-ιστορικού"/>
-      <w:bookmarkStart w:id="19" w:name="_Toc227829469"/>
+      <w:bookmarkStart w:id="19" w:name="_Toc227843717"/>
+      <w:bookmarkEnd w:id="16"/>
       <w:r>
         <w:t>Διακομιστής ιστορικού</w:t>
       </w:r>
@@ -10366,16 +10367,16 @@
         </w:rPr>
         <w:lastRenderedPageBreak/>
         <w:drawing>
-          <wp:inline distT="0" distB="0" distL="0" distR="0" wp14:anchorId="6849353B" wp14:editId="5B8C17F6">
+          <wp:inline distT="0" distB="0" distL="0" distR="0" wp14:anchorId="2BDB4DD8" wp14:editId="17462CD1">
             <wp:extent cx="6692900" cy="3307628"/>
             <wp:effectExtent l="0" t="0" r="0" b="0"/>
-            <wp:docPr id="96" name="Picture" descr="Εικόνα 22"/>
+            <wp:docPr id="97" name="Picture" descr="Εικόνα 22"/>
             <wp:cNvGraphicFramePr/>
             <a:graphic xmlns:a="http://schemas.openxmlformats.org/drawingml/2006/main">
               <a:graphicData uri="http://schemas.openxmlformats.org/drawingml/2006/picture">
                 <pic:pic xmlns:pic="http://schemas.openxmlformats.org/drawingml/2006/picture">
                   <pic:nvPicPr>
-                    <pic:cNvPr id="97" name="Picture" descr="images/img22.png"/>
+                    <pic:cNvPr id="98" name="Picture" descr="images/img22.png"/>
                     <pic:cNvPicPr>
                       <a:picLocks noChangeAspect="1" noChangeArrowheads="1"/>
                     </pic:cNvPicPr>
@@ -10417,16 +10418,16 @@
           <w:noProof/>
         </w:rPr>
         <w:drawing>
-          <wp:inline distT="0" distB="0" distL="0" distR="0" wp14:anchorId="2880180D" wp14:editId="552782D6">
+          <wp:inline distT="0" distB="0" distL="0" distR="0" wp14:anchorId="7A31FD21" wp14:editId="6AC8C576">
             <wp:extent cx="6692900" cy="4050863"/>
             <wp:effectExtent l="0" t="0" r="0" b="0"/>
-            <wp:docPr id="99" name="Picture" descr="Εικόνα 23"/>
+            <wp:docPr id="100" name="Picture" descr="Εικόνα 23"/>
             <wp:cNvGraphicFramePr/>
             <a:graphic xmlns:a="http://schemas.openxmlformats.org/drawingml/2006/main">
               <a:graphicData uri="http://schemas.openxmlformats.org/drawingml/2006/picture">
                 <pic:pic xmlns:pic="http://schemas.openxmlformats.org/drawingml/2006/picture">
                   <pic:nvPicPr>
-                    <pic:cNvPr id="100" name="Picture" descr="images/img23.png"/>
+                    <pic:cNvPr id="101" name="Picture" descr="images/img23.png"/>
                     <pic:cNvPicPr>
                       <a:picLocks noChangeAspect="1" noChangeArrowheads="1"/>
                     </pic:cNvPicPr>
@@ -10967,8 +10968,7 @@
         <w:pStyle w:val="Heading1"/>
       </w:pPr>
       <w:bookmarkStart w:id="20" w:name="τερματισμός-και-καθαρισμός-υποδομής"/>
-      <w:bookmarkStart w:id="21" w:name="_Toc227829470"/>
-      <w:bookmarkEnd w:id="16"/>
+      <w:bookmarkStart w:id="21" w:name="_Toc227843718"/>
       <w:bookmarkEnd w:id="18"/>
       <w:r>
         <w:t>Τερματισμός και καθαρισμός υποδομής</w:t>
@@ -11569,7 +11569,7 @@
   <w:abstractNum w:abstractNumId="9" w15:restartNumberingAfterBreak="0">
     <w:nsid w:val="0000A990"/>
     <w:multiLevelType w:val="multilevel"/>
-    <w:tmpl w:val="3BDCCCBA"/>
+    <w:tmpl w:val="B4EA15AE"/>
     <w:lvl w:ilvl="0">
       <w:numFmt w:val="bullet"/>
       <w:lvlText w:val=" "/>
@@ -11646,7 +11646,7 @@
   <w:abstractNum w:abstractNumId="10" w15:restartNumberingAfterBreak="0">
     <w:nsid w:val="0000A991"/>
     <w:multiLevelType w:val="multilevel"/>
-    <w:tmpl w:val="7AEE8E2A"/>
+    <w:tmpl w:val="E68AD19E"/>
     <w:lvl w:ilvl="0">
       <w:numFmt w:val="bullet"/>
       <w:lvlText w:val=""/>
@@ -11747,94 +11747,94 @@
       </w:rPr>
     </w:lvl>
   </w:abstractNum>
-  <w:num w:numId="1" w16cid:durableId="977607177">
+  <w:num w:numId="1" w16cid:durableId="1310938684">
     <w:abstractNumId w:val="8"/>
   </w:num>
-  <w:num w:numId="2" w16cid:durableId="713235722">
+  <w:num w:numId="2" w16cid:durableId="415135902">
     <w:abstractNumId w:val="6"/>
   </w:num>
-  <w:num w:numId="3" w16cid:durableId="398792495">
+  <w:num w:numId="3" w16cid:durableId="1963268401">
     <w:abstractNumId w:val="5"/>
   </w:num>
-  <w:num w:numId="4" w16cid:durableId="1535464392">
+  <w:num w:numId="4" w16cid:durableId="1210604110">
     <w:abstractNumId w:val="4"/>
   </w:num>
-  <w:num w:numId="5" w16cid:durableId="745765500">
+  <w:num w:numId="5" w16cid:durableId="1189368747">
     <w:abstractNumId w:val="7"/>
   </w:num>
-  <w:num w:numId="6" w16cid:durableId="553351189">
+  <w:num w:numId="6" w16cid:durableId="211500196">
     <w:abstractNumId w:val="3"/>
   </w:num>
-  <w:num w:numId="7" w16cid:durableId="1669558688">
+  <w:num w:numId="7" w16cid:durableId="880827011">
     <w:abstractNumId w:val="2"/>
   </w:num>
-  <w:num w:numId="8" w16cid:durableId="425422374">
+  <w:num w:numId="8" w16cid:durableId="180314184">
     <w:abstractNumId w:val="1"/>
   </w:num>
-  <w:num w:numId="9" w16cid:durableId="1697190180">
+  <w:num w:numId="9" w16cid:durableId="1856529266">
     <w:abstractNumId w:val="0"/>
   </w:num>
-  <w:num w:numId="10" w16cid:durableId="210656276">
+  <w:num w:numId="10" w16cid:durableId="60717883">
     <w:abstractNumId w:val="9"/>
   </w:num>
-  <w:num w:numId="11" w16cid:durableId="317466818">
+  <w:num w:numId="11" w16cid:durableId="1924143424">
     <w:abstractNumId w:val="10"/>
   </w:num>
-  <w:num w:numId="12" w16cid:durableId="684675671">
+  <w:num w:numId="12" w16cid:durableId="1125807288">
     <w:abstractNumId w:val="10"/>
   </w:num>
-  <w:num w:numId="13" w16cid:durableId="407726966">
+  <w:num w:numId="13" w16cid:durableId="1557081743">
     <w:abstractNumId w:val="10"/>
   </w:num>
-  <w:num w:numId="14" w16cid:durableId="1066494480">
+  <w:num w:numId="14" w16cid:durableId="1387099402">
     <w:abstractNumId w:val="10"/>
   </w:num>
-  <w:num w:numId="15" w16cid:durableId="1344937841">
+  <w:num w:numId="15" w16cid:durableId="1224680846">
     <w:abstractNumId w:val="10"/>
   </w:num>
-  <w:num w:numId="16" w16cid:durableId="1857429090">
+  <w:num w:numId="16" w16cid:durableId="114296425">
     <w:abstractNumId w:val="10"/>
   </w:num>
-  <w:num w:numId="17" w16cid:durableId="617640510">
+  <w:num w:numId="17" w16cid:durableId="377629358">
     <w:abstractNumId w:val="10"/>
   </w:num>
-  <w:num w:numId="18" w16cid:durableId="669678860">
+  <w:num w:numId="18" w16cid:durableId="79915740">
     <w:abstractNumId w:val="10"/>
   </w:num>
-  <w:num w:numId="19" w16cid:durableId="1418477669">
+  <w:num w:numId="19" w16cid:durableId="1996100547">
     <w:abstractNumId w:val="10"/>
   </w:num>
-  <w:num w:numId="20" w16cid:durableId="596863037">
+  <w:num w:numId="20" w16cid:durableId="267393299">
     <w:abstractNumId w:val="10"/>
   </w:num>
-  <w:num w:numId="21" w16cid:durableId="901596537">
+  <w:num w:numId="21" w16cid:durableId="1010371141">
     <w:abstractNumId w:val="10"/>
   </w:num>
-  <w:num w:numId="22" w16cid:durableId="2133552691">
+  <w:num w:numId="22" w16cid:durableId="935332420">
     <w:abstractNumId w:val="10"/>
   </w:num>
-  <w:num w:numId="23" w16cid:durableId="858931820">
+  <w:num w:numId="23" w16cid:durableId="1377655465">
     <w:abstractNumId w:val="10"/>
   </w:num>
-  <w:num w:numId="24" w16cid:durableId="1812408779">
+  <w:num w:numId="24" w16cid:durableId="1656296836">
     <w:abstractNumId w:val="10"/>
   </w:num>
-  <w:num w:numId="25" w16cid:durableId="81142878">
+  <w:num w:numId="25" w16cid:durableId="1949776068">
     <w:abstractNumId w:val="10"/>
   </w:num>
-  <w:num w:numId="26" w16cid:durableId="1194808400">
+  <w:num w:numId="26" w16cid:durableId="1549682076">
     <w:abstractNumId w:val="10"/>
   </w:num>
-  <w:num w:numId="27" w16cid:durableId="1843659757">
+  <w:num w:numId="27" w16cid:durableId="213009516">
     <w:abstractNumId w:val="10"/>
   </w:num>
-  <w:num w:numId="28" w16cid:durableId="1090004159">
+  <w:num w:numId="28" w16cid:durableId="145321639">
     <w:abstractNumId w:val="10"/>
   </w:num>
-  <w:num w:numId="29" w16cid:durableId="450978407">
+  <w:num w:numId="29" w16cid:durableId="1668050495">
     <w:abstractNumId w:val="10"/>
   </w:num>
-  <w:num w:numId="30" w16cid:durableId="1009792451">
+  <w:num w:numId="30" w16cid:durableId="533880967">
     <w:abstractNumId w:val="10"/>
   </w:num>
 </w:numbering>
@@ -23655,7 +23655,7 @@
     <w:autoRedefine/>
     <w:uiPriority w:val="39"/>
     <w:unhideWhenUsed/>
-    <w:rsid w:val="00F177D2"/>
+    <w:rsid w:val="00851B2B"/>
     <w:pPr>
       <w:spacing w:after="100"/>
     </w:pPr>
@@ -23667,7 +23667,7 @@
     <w:autoRedefine/>
     <w:uiPriority w:val="39"/>
     <w:unhideWhenUsed/>
-    <w:rsid w:val="00F177D2"/>
+    <w:rsid w:val="00851B2B"/>
     <w:pPr>
       <w:spacing w:after="100"/>
       <w:ind w:left="220"/>
@@ -23678,7 +23678,7 @@
     <w:basedOn w:val="DefaultParagraphFont"/>
     <w:uiPriority w:val="99"/>
     <w:unhideWhenUsed/>
-    <w:rsid w:val="00F177D2"/>
+    <w:rsid w:val="00851B2B"/>
     <w:rPr>
       <w:color w:val="0000FF" w:themeColor="hyperlink"/>
       <w:u w:val="single"/>

</xml_diff>